<commit_message>
Update imdbDocumentation with latest changes
</commit_message>
<xml_diff>
--- a/docs/imdbDocumentation.docx
+++ b/docs/imdbDocumentation.docx
@@ -27,15 +27,7 @@
           <w:sz w:val="56"/>
           <w:szCs w:val="56"/>
         </w:rPr>
-        <w:t xml:space="preserve"> Data Engineering Project </w:t>
-      </w:r>
-      <w:r>
-        <w:rPr>
-          <w:color w:val="BF8F00" w:themeColor="accent4" w:themeShade="BF"/>
-          <w:sz w:val="56"/>
-          <w:szCs w:val="56"/>
-        </w:rPr>
-        <w:t xml:space="preserve">: </w:t>
+        <w:t xml:space="preserve"> Data Engineering Project : </w:t>
       </w:r>
       <w:proofErr w:type="spellStart"/>
       <w:r>
@@ -16787,19 +16779,7 @@
           <w:lang w:eastAsia="ro-RO"/>
           <w14:ligatures w14:val="none"/>
         </w:rPr>
-        <w:t>imdbProjec</w:t>
-      </w:r>
-      <w:r>
-        <w:rPr>
-          <w:rFonts w:ascii="Times New Roman" w:eastAsia="Times New Roman" w:hAnsi="Times New Roman" w:cs="Times New Roman"/>
-          <w:color w:val="1F1F1F"/>
-          <w:kern w:val="0"/>
-          <w:sz w:val="24"/>
-          <w:szCs w:val="24"/>
-          <w:lang w:eastAsia="ro-RO"/>
-          <w14:ligatures w14:val="none"/>
-        </w:rPr>
-        <w:t>t</w:t>
+        <w:t>imdbProject</w:t>
       </w:r>
       <w:proofErr w:type="spellEnd"/>
     </w:p>
@@ -17428,19 +17408,7 @@
           <w:lang w:eastAsia="ro-RO"/>
           <w14:ligatures w14:val="none"/>
         </w:rPr>
-        <w:t xml:space="preserve"> -d </w:t>
-      </w:r>
-      <w:r>
-        <w:rPr>
-          <w:rFonts w:ascii="Times New Roman" w:eastAsia="Times New Roman" w:hAnsi="Times New Roman" w:cs="Times New Roman"/>
-          <w:color w:val="1F1F1F"/>
-          <w:kern w:val="0"/>
-          <w:sz w:val="24"/>
-          <w:szCs w:val="24"/>
-          <w:lang w:eastAsia="ro-RO"/>
-          <w14:ligatures w14:val="none"/>
-        </w:rPr>
-        <w:t>–</w:t>
+        <w:t xml:space="preserve"> -d –</w:t>
       </w:r>
       <w:proofErr w:type="spellStart"/>
       <w:r>
@@ -20300,6 +20268,9 @@
     </w:p>
     <w:p>
       <w:r>
+        <w:rPr>
+          <w:noProof/>
+        </w:rPr>
         <w:drawing>
           <wp:inline distT="0" distB="0" distL="0" distR="0" wp14:anchorId="0ABE4F0D" wp14:editId="204CAF9D">
             <wp:extent cx="4543425" cy="1608128"/>
@@ -21777,6 +21748,7 @@
       </w:pPr>
       <w:r>
         <w:rPr>
+          <w:noProof/>
           <w:color w:val="5B9BD5" w:themeColor="accent1"/>
           <w14:shadow w14:blurRad="38100" w14:dist="25400" w14:dir="5400000" w14:sx="100000" w14:sy="100000" w14:kx="0" w14:ky="0" w14:algn="ctr">
             <w14:srgbClr w14:val="6E747A">
@@ -21790,7 +21762,7 @@
           </w14:textOutline>
         </w:rPr>
         <w:drawing>
-          <wp:anchor distT="0" distB="0" distL="114300" distR="114300" simplePos="0" relativeHeight="251661312" behindDoc="0" locked="0" layoutInCell="1" allowOverlap="1" wp14:anchorId="2912AE55" wp14:editId="09151D37">
+          <wp:anchor distT="0" distB="0" distL="114300" distR="114300" simplePos="0" relativeHeight="251661312" behindDoc="0" locked="0" layoutInCell="1" allowOverlap="1" wp14:anchorId="2912AE55" wp14:editId="25E11C51">
             <wp:simplePos x="0" y="0"/>
             <wp:positionH relativeFrom="margin">
               <wp:posOffset>-1373</wp:posOffset>
@@ -23456,8 +23428,11 @@
         </w:rPr>
       </w:pPr>
       <w:r>
+        <w:rPr>
+          <w:noProof/>
+        </w:rPr>
         <w:drawing>
-          <wp:anchor distT="0" distB="0" distL="114300" distR="114300" simplePos="0" relativeHeight="251663360" behindDoc="0" locked="0" layoutInCell="1" allowOverlap="1" wp14:anchorId="6B3CF0C2" wp14:editId="057588FE">
+          <wp:anchor distT="0" distB="0" distL="114300" distR="114300" simplePos="0" relativeHeight="251663360" behindDoc="0" locked="0" layoutInCell="1" allowOverlap="1" wp14:anchorId="6B3CF0C2" wp14:editId="1CB6A4E8">
             <wp:simplePos x="0" y="0"/>
             <wp:positionH relativeFrom="column">
               <wp:posOffset>-137777</wp:posOffset>
@@ -23507,8 +23482,11 @@
         </w:drawing>
       </w:r>
       <w:r>
+        <w:rPr>
+          <w:noProof/>
+        </w:rPr>
         <w:drawing>
-          <wp:anchor distT="0" distB="0" distL="114300" distR="114300" simplePos="0" relativeHeight="251662336" behindDoc="0" locked="0" layoutInCell="1" allowOverlap="1" wp14:anchorId="036E2AE7" wp14:editId="4ADC6E05">
+          <wp:anchor distT="0" distB="0" distL="114300" distR="114300" simplePos="0" relativeHeight="251662336" behindDoc="0" locked="0" layoutInCell="1" allowOverlap="1" wp14:anchorId="036E2AE7" wp14:editId="28ECBA5F">
             <wp:simplePos x="0" y="0"/>
             <wp:positionH relativeFrom="column">
               <wp:posOffset>-139065</wp:posOffset>
@@ -25437,227 +25415,7 @@
           <w:sz w:val="24"/>
           <w:szCs w:val="24"/>
         </w:rPr>
-        <w:t xml:space="preserve"> overrated titles (</w:t>
-      </w:r>
-      <w:proofErr w:type="spellStart"/>
-      <w:r>
-        <w:rPr>
-          <w:rFonts w:ascii="Times New Roman" w:hAnsi="Times New Roman" w:cs="Times New Roman"/>
-          <w:b/>
-          <w:bCs/>
-          <w:sz w:val="24"/>
-          <w:szCs w:val="24"/>
-        </w:rPr>
-        <w:t>overrated_count</w:t>
-      </w:r>
-      <w:proofErr w:type="spellEnd"/>
-      <w:r>
-        <w:rPr>
-          <w:rFonts w:ascii="Times New Roman" w:hAnsi="Times New Roman" w:cs="Times New Roman"/>
-          <w:b/>
-          <w:bCs/>
-          <w:sz w:val="24"/>
-          <w:szCs w:val="24"/>
-        </w:rPr>
-        <w:t xml:space="preserve"> = 0). The </w:t>
-      </w:r>
-      <w:proofErr w:type="spellStart"/>
-      <w:r>
-        <w:rPr>
-          <w:rFonts w:ascii="Times New Roman" w:hAnsi="Times New Roman" w:cs="Times New Roman"/>
-          <w:b/>
-          <w:bCs/>
-          <w:sz w:val="24"/>
-          <w:szCs w:val="24"/>
-        </w:rPr>
-        <w:t>use</w:t>
-      </w:r>
-      <w:proofErr w:type="spellEnd"/>
-      <w:r>
-        <w:rPr>
-          <w:rFonts w:ascii="Times New Roman" w:hAnsi="Times New Roman" w:cs="Times New Roman"/>
-          <w:b/>
-          <w:bCs/>
-          <w:sz w:val="24"/>
-          <w:szCs w:val="24"/>
-        </w:rPr>
-        <w:t xml:space="preserve"> of NULLIF(..., 0) </w:t>
-      </w:r>
-      <w:proofErr w:type="spellStart"/>
-      <w:r>
-        <w:rPr>
-          <w:rFonts w:ascii="Times New Roman" w:hAnsi="Times New Roman" w:cs="Times New Roman"/>
-          <w:b/>
-          <w:bCs/>
-          <w:sz w:val="24"/>
-          <w:szCs w:val="24"/>
-        </w:rPr>
-        <w:t>shields</w:t>
-      </w:r>
-      <w:proofErr w:type="spellEnd"/>
-      <w:r>
-        <w:rPr>
-          <w:rFonts w:ascii="Times New Roman" w:hAnsi="Times New Roman" w:cs="Times New Roman"/>
-          <w:b/>
-          <w:bCs/>
-          <w:sz w:val="24"/>
-          <w:szCs w:val="24"/>
-        </w:rPr>
-        <w:t xml:space="preserve"> </w:t>
-      </w:r>
-      <w:proofErr w:type="spellStart"/>
-      <w:r>
-        <w:rPr>
-          <w:rFonts w:ascii="Times New Roman" w:hAnsi="Times New Roman" w:cs="Times New Roman"/>
-          <w:b/>
-          <w:bCs/>
-          <w:sz w:val="24"/>
-          <w:szCs w:val="24"/>
-        </w:rPr>
-        <w:t>the</w:t>
-      </w:r>
-      <w:proofErr w:type="spellEnd"/>
-      <w:r>
-        <w:rPr>
-          <w:rFonts w:ascii="Times New Roman" w:hAnsi="Times New Roman" w:cs="Times New Roman"/>
-          <w:b/>
-          <w:bCs/>
-          <w:sz w:val="24"/>
-          <w:szCs w:val="24"/>
-        </w:rPr>
-        <w:t xml:space="preserve"> </w:t>
-      </w:r>
-      <w:proofErr w:type="spellStart"/>
-      <w:r>
-        <w:rPr>
-          <w:rFonts w:ascii="Times New Roman" w:hAnsi="Times New Roman" w:cs="Times New Roman"/>
-          <w:b/>
-          <w:bCs/>
-          <w:sz w:val="24"/>
-          <w:szCs w:val="24"/>
-        </w:rPr>
-        <w:t>query</w:t>
-      </w:r>
-      <w:proofErr w:type="spellEnd"/>
-      <w:r>
-        <w:rPr>
-          <w:rFonts w:ascii="Times New Roman" w:hAnsi="Times New Roman" w:cs="Times New Roman"/>
-          <w:b/>
-          <w:bCs/>
-          <w:sz w:val="24"/>
-          <w:szCs w:val="24"/>
-        </w:rPr>
-        <w:t xml:space="preserve"> </w:t>
-      </w:r>
-      <w:proofErr w:type="spellStart"/>
-      <w:r>
-        <w:rPr>
-          <w:rFonts w:ascii="Times New Roman" w:hAnsi="Times New Roman" w:cs="Times New Roman"/>
-          <w:b/>
-          <w:bCs/>
-          <w:sz w:val="24"/>
-          <w:szCs w:val="24"/>
-        </w:rPr>
-        <w:t>from</w:t>
-      </w:r>
-      <w:proofErr w:type="spellEnd"/>
-      <w:r>
-        <w:rPr>
-          <w:rFonts w:ascii="Times New Roman" w:hAnsi="Times New Roman" w:cs="Times New Roman"/>
-          <w:b/>
-          <w:bCs/>
-          <w:sz w:val="24"/>
-          <w:szCs w:val="24"/>
-        </w:rPr>
-        <w:t xml:space="preserve"> a </w:t>
-      </w:r>
-      <w:proofErr w:type="spellStart"/>
-      <w:r>
-        <w:rPr>
-          <w:rFonts w:ascii="Times New Roman" w:hAnsi="Times New Roman" w:cs="Times New Roman"/>
-          <w:b/>
-          <w:bCs/>
-          <w:sz w:val="24"/>
-          <w:szCs w:val="24"/>
-        </w:rPr>
-        <w:t>division</w:t>
-      </w:r>
-      <w:proofErr w:type="spellEnd"/>
-      <w:r>
-        <w:rPr>
-          <w:rFonts w:ascii="Times New Roman" w:hAnsi="Times New Roman" w:cs="Times New Roman"/>
-          <w:b/>
-          <w:bCs/>
-          <w:sz w:val="24"/>
-          <w:szCs w:val="24"/>
-        </w:rPr>
-        <w:t>-</w:t>
-      </w:r>
-      <w:proofErr w:type="spellStart"/>
-      <w:r>
-        <w:rPr>
-          <w:rFonts w:ascii="Times New Roman" w:hAnsi="Times New Roman" w:cs="Times New Roman"/>
-          <w:b/>
-          <w:bCs/>
-          <w:sz w:val="24"/>
-          <w:szCs w:val="24"/>
-        </w:rPr>
-        <w:t>by</w:t>
-      </w:r>
-      <w:proofErr w:type="spellEnd"/>
-      <w:r>
-        <w:rPr>
-          <w:rFonts w:ascii="Times New Roman" w:hAnsi="Times New Roman" w:cs="Times New Roman"/>
-          <w:b/>
-          <w:bCs/>
-          <w:sz w:val="24"/>
-          <w:szCs w:val="24"/>
-        </w:rPr>
-        <w:t xml:space="preserve">-zero </w:t>
-      </w:r>
-      <w:proofErr w:type="spellStart"/>
-      <w:r>
-        <w:rPr>
-          <w:rFonts w:ascii="Times New Roman" w:hAnsi="Times New Roman" w:cs="Times New Roman"/>
-          <w:b/>
-          <w:bCs/>
-          <w:sz w:val="24"/>
-          <w:szCs w:val="24"/>
-        </w:rPr>
-        <w:t>runtime</w:t>
-      </w:r>
-      <w:proofErr w:type="spellEnd"/>
-      <w:r>
-        <w:rPr>
-          <w:rFonts w:ascii="Times New Roman" w:hAnsi="Times New Roman" w:cs="Times New Roman"/>
-          <w:b/>
-          <w:bCs/>
-          <w:sz w:val="24"/>
-          <w:szCs w:val="24"/>
-        </w:rPr>
-        <w:t xml:space="preserve"> </w:t>
-      </w:r>
-      <w:proofErr w:type="spellStart"/>
-      <w:r>
-        <w:rPr>
-          <w:rFonts w:ascii="Times New Roman" w:hAnsi="Times New Roman" w:cs="Times New Roman"/>
-          <w:b/>
-          <w:bCs/>
-          <w:sz w:val="24"/>
-          <w:szCs w:val="24"/>
-        </w:rPr>
-        <w:t>error</w:t>
-      </w:r>
-      <w:proofErr w:type="spellEnd"/>
-      <w:r>
-        <w:rPr>
-          <w:rFonts w:ascii="Times New Roman" w:hAnsi="Times New Roman" w:cs="Times New Roman"/>
-          <w:b/>
-          <w:bCs/>
-          <w:sz w:val="24"/>
-          <w:szCs w:val="24"/>
-        </w:rPr>
-        <w:t xml:space="preserve">, </w:t>
+        <w:t xml:space="preserve"> overrated titles (overrated_count = 0). The use of NULLIF(..., 0) shields the query from a division-by-zero runtime error, </w:t>
       </w:r>
       <w:proofErr w:type="spellStart"/>
       <w:r>
@@ -36032,6 +35790,7 @@
   <w:style w:type="character" w:default="1" w:styleId="DefaultParagraphFont">
     <w:name w:val="Default Paragraph Font"/>
     <w:uiPriority w:val="1"/>
+    <w:semiHidden/>
     <w:unhideWhenUsed/>
   </w:style>
   <w:style w:type="table" w:default="1" w:styleId="TableNormal">

</xml_diff>